<commit_message>
Attribute the deliverables to Kelvin Addae Kwarteng (22427564)
- Replaced the 'Prepared by: [Your Name]' placeholder in six documents and added
  the byline to the SRS, which had none.
- Name and student ID now appear in the page footer of every document, so any
  printed or extracted page is attributable.
- Set the Word document properties (author, last modified by, title), which were
  all reading 'Un-named' in the file's Info pane.
- README carries the same attribution.

Also fixes stale footer versions found while doing this: the footers still showed
the version each document carried before its last bump — Design read v1.5 against
a v1.7 title page, the Testing Report v1.2 against v1.4, the Debt Ledger v1.2
against v1.4, and the Maintenance Plan v1.1 against v1.2. Footers are now derived
from the title-block version.
</commit_message>
<xml_diff>
--- a/docs/MediCore_HMS_Design_Document_v1.7.docx
+++ b/docs/MediCore_HMS_Design_Document_v1.7.docx
@@ -80,7 +80,7 @@
           <w:sz w:val="24"/>
           <w:szCs w:val="24"/>
         </w:rPr>
-        <w:t xml:space="preserve">Prepared by: [Your Name]</w:t>
+        <w:t>Prepared by: Kelvin Addae Kwarteng  ·  Student ID 22427564</w:t>
       </w:r>
     </w:p>
     <w:p>
@@ -6103,7 +6103,7 @@
         <w:sz w:val="18"/>
         <w:szCs w:val="18"/>
       </w:rPr>
-      <w:t xml:space="preserve">MediCore HMS — System Design Document v1.5    ·    Page </w:t>
+      <w:t xml:space="preserve">MediCore HMS — System Design Document v1.7    ·    Kelvin Addae Kwarteng (22427564)    ·    Page </w:t>
     </w:r>
     <w:r>
       <w:rPr>

</xml_diff>